<commit_message>
alterações gerenciamento de projeto
</commit_message>
<xml_diff>
--- a/gq-spinoff/1.Requisitos/gq-spinoff - Visão.docx
+++ b/gq-spinoff/1.Requisitos/gq-spinoff - Visão.docx
@@ -2074,24 +2074,14 @@
         </w:rPr>
         <w:t xml:space="preserve">ARUM TECNOLOGIA. SpinOff. Disponível em: </w:t>
       </w:r>
-      <w:r>
-        <w:fldChar w:fldCharType="begin"/>
-      </w:r>
-      <w:r>
-        <w:instrText>HYPERLINK "http://arum.tec.br/SpinOff/index.htm" \t "_new"</w:instrText>
-      </w:r>
-      <w:r>
-        <w:fldChar w:fldCharType="separate"/>
-      </w:r>
-      <w:r>
-        <w:rPr>
-          <w:lang w:val="pt-PT" w:eastAsia="en-US"/>
-        </w:rPr>
-        <w:t>http://arum.tec.br/SpinOff/index.htm</w:t>
-      </w:r>
-      <w:r>
-        <w:fldChar w:fldCharType="end"/>
-      </w:r>
+      <w:hyperlink r:id="rId11" w:tgtFrame="_new" w:history="1">
+        <w:r>
+          <w:rPr>
+            <w:lang w:val="pt-PT" w:eastAsia="en-US"/>
+          </w:rPr>
+          <w:t>http://arum.tec.br/SpinOff/index.htm</w:t>
+        </w:r>
+      </w:hyperlink>
       <w:r>
         <w:rPr>
           <w:lang w:val="pt-PT" w:eastAsia="en-US"/>
@@ -2112,8 +2102,8 @@
           <w:tab w:val="left" w:pos="3700"/>
         </w:tabs>
         <w:sectPr>
-          <w:headerReference w:type="first" r:id="rId11"/>
-          <w:footerReference w:type="first" r:id="rId12"/>
+          <w:headerReference w:type="first" r:id="rId12"/>
+          <w:footerReference w:type="first" r:id="rId13"/>
           <w:pgSz w:w="11907" w:h="16840" w:code="9"/>
           <w:pgMar w:top="851" w:right="851" w:bottom="851" w:left="1418" w:header="851" w:footer="851" w:gutter="0"/>
           <w:cols w:space="708"/>
@@ -2278,26 +2268,6 @@
           </w:p>
           <w:p>
             <w:pPr>
-              <w:pStyle w:val="Instruo"/>
-              <w:numPr>
-                <w:ilvl w:val="0"/>
-                <w:numId w:val="12"/>
-              </w:numPr>
-              <w:rPr>
-                <w:i w:val="0"/>
-                <w:color w:val="000000"/>
-              </w:rPr>
-            </w:pPr>
-            <w:r>
-              <w:rPr>
-                <w:i w:val="0"/>
-                <w:color w:val="000000"/>
-              </w:rPr>
-              <w:t>Aluno</w:t>
-            </w:r>
-          </w:p>
-          <w:p>
-            <w:pPr>
               <w:pStyle w:val="PargrafodaLista"/>
               <w:numPr>
                 <w:ilvl w:val="0"/>
@@ -2305,7 +2275,7 @@
               </w:numPr>
             </w:pPr>
             <w:r>
-              <w:t>Professor</w:t>
+              <w:t>Aluno</w:t>
             </w:r>
           </w:p>
         </w:tc>
@@ -2322,33 +2292,6 @@
                 <w:color w:val="000000"/>
               </w:rPr>
             </w:pPr>
-          </w:p>
-          <w:p>
-            <w:pPr>
-              <w:pStyle w:val="Instruo"/>
-              <w:numPr>
-                <w:ilvl w:val="0"/>
-                <w:numId w:val="10"/>
-              </w:numPr>
-              <w:rPr>
-                <w:i w:val="0"/>
-                <w:color w:val="000000"/>
-              </w:rPr>
-            </w:pPr>
-            <w:r>
-              <w:rPr>
-                <w:i w:val="0"/>
-                <w:color w:val="000000"/>
-              </w:rPr>
-              <w:t>Monitoramento mais lento e trabalhoso</w:t>
-            </w:r>
-            <w:r>
-              <w:rPr>
-                <w:i w:val="0"/>
-                <w:color w:val="000000"/>
-              </w:rPr>
-              <w:t>.</w:t>
-            </w:r>
           </w:p>
           <w:p>
             <w:pPr>
@@ -2368,34 +2311,17 @@
             <w:tcW w:w="5683" w:type="dxa"/>
           </w:tcPr>
           <w:p>
-            <w:pPr>
-              <w:pStyle w:val="PargrafodaLista"/>
+            <w:r>
               <w:rPr>
                 <w:lang w:val="pt-PT"/>
               </w:rPr>
-            </w:pPr>
-          </w:p>
-          <w:p>
-            <w:r>
-              <w:t>C</w:t>
+              <w:t xml:space="preserve">Como </w:t>
             </w:r>
             <w:r>
-              <w:t>omo professor, desejo monitorar os projetos dos meus alunos em um único ambiente, evitando a necessidade de múltiplos downloads de planilhas.</w:t>
-            </w:r>
-          </w:p>
-          <w:p>
-            <w:pPr>
               <w:rPr>
                 <w:lang w:val="pt-PT"/>
               </w:rPr>
-            </w:pPr>
-          </w:p>
-          <w:p>
-            <w:r>
-              <w:rPr>
-                <w:lang w:val="pt-PT"/>
-              </w:rPr>
-              <w:t xml:space="preserve">Como aluno, </w:t>
+              <w:t xml:space="preserve">aluno, </w:t>
             </w:r>
             <w:r>
               <w:rPr>
@@ -2407,7 +2333,19 @@
               <w:rPr>
                 <w:lang w:val="pt-PT"/>
               </w:rPr>
-              <w:t xml:space="preserve"> centralizar o acompanhamento dos meus projetos</w:t>
+              <w:t xml:space="preserve"> centralizar o acompanhamento do</w:t>
+            </w:r>
+            <w:r>
+              <w:rPr>
+                <w:lang w:val="pt-PT"/>
+              </w:rPr>
+              <w:t>s</w:t>
+            </w:r>
+            <w:r>
+              <w:rPr>
+                <w:lang w:val="pt-PT"/>
+              </w:rPr>
+              <w:t xml:space="preserve"> meus projetos</w:t>
             </w:r>
             <w:r>
               <w:rPr>
@@ -2480,26 +2418,6 @@
               <w:pStyle w:val="Instruo"/>
               <w:ind w:left="720"/>
             </w:pPr>
-          </w:p>
-          <w:p>
-            <w:pPr>
-              <w:pStyle w:val="Instruo"/>
-              <w:numPr>
-                <w:ilvl w:val="0"/>
-                <w:numId w:val="11"/>
-              </w:numPr>
-              <w:rPr>
-                <w:i w:val="0"/>
-                <w:color w:val="000000"/>
-              </w:rPr>
-            </w:pPr>
-            <w:r>
-              <w:rPr>
-                <w:i w:val="0"/>
-                <w:color w:val="000000"/>
-              </w:rPr>
-              <w:t>Aluno</w:t>
-            </w:r>
           </w:p>
           <w:p>
             <w:pPr>
@@ -2620,32 +2538,7 @@
               <w:rPr>
                 <w:lang w:val="pt-PT"/>
               </w:rPr>
-              <w:t xml:space="preserve"> visando a melhoria contínua do processo, sem imapactar os projetos em andamento ou finalizados.</w:t>
-            </w:r>
-          </w:p>
-          <w:p>
-            <w:pPr>
-              <w:rPr>
-                <w:lang w:val="pt-PT"/>
-              </w:rPr>
-            </w:pPr>
-          </w:p>
-          <w:p>
-            <w:pPr>
-              <w:rPr>
-                <w:lang w:val="pt-PT"/>
-              </w:rPr>
-            </w:pPr>
-            <w:r>
-              <w:t xml:space="preserve">Como aluno, desejo escolher qual versão do modelo </w:t>
-            </w:r>
-            <w:proofErr w:type="spellStart"/>
-            <w:r>
-              <w:t>Spinoff</w:t>
-            </w:r>
-            <w:proofErr w:type="spellEnd"/>
-            <w:r>
-              <w:t xml:space="preserve"> utilizar para realizar a verificação de um novo projeto.</w:t>
+              <w:t xml:space="preserve"> visando a melhoria contínua do processo, sem impactar os projetos em andamento ou finalizados.</w:t>
             </w:r>
           </w:p>
           <w:p>
@@ -2685,8 +2578,8 @@
           <w:tab w:val="left" w:pos="3700"/>
         </w:tabs>
         <w:sectPr>
-          <w:headerReference w:type="first" r:id="rId13"/>
-          <w:footerReference w:type="first" r:id="rId14"/>
+          <w:headerReference w:type="first" r:id="rId14"/>
+          <w:footerReference w:type="first" r:id="rId15"/>
           <w:pgSz w:w="16840" w:h="11907" w:orient="landscape" w:code="9"/>
           <w:pgMar w:top="851" w:right="851" w:bottom="1418" w:left="851" w:header="851" w:footer="851" w:gutter="0"/>
           <w:cols w:space="708"/>
@@ -3007,7 +2900,23 @@
           <w:color w:val="000000"/>
           <w:lang w:val="pt-PT"/>
         </w:rPr>
-        <w:t>Deve ser uma aplicação web;</w:t>
+        <w:t xml:space="preserve">Deve ser uma aplicação </w:t>
+      </w:r>
+      <w:r>
+        <w:rPr>
+          <w:i w:val="0"/>
+          <w:color w:val="000000"/>
+          <w:lang w:val="pt-PT"/>
+        </w:rPr>
+        <w:t>desktop</w:t>
+      </w:r>
+      <w:r>
+        <w:rPr>
+          <w:i w:val="0"/>
+          <w:color w:val="000000"/>
+          <w:lang w:val="pt-PT"/>
+        </w:rPr>
+        <w:t>;</w:t>
       </w:r>
     </w:p>
     <w:p>
@@ -3018,6 +2927,7 @@
           <w:numId w:val="7"/>
         </w:numPr>
         <w:rPr>
+          <w:i/>
           <w:lang w:val="pt-PT"/>
         </w:rPr>
       </w:pPr>
@@ -3047,23 +2957,7 @@
           <w:color w:val="000000"/>
           <w:lang w:val="pt-PT"/>
         </w:rPr>
-        <w:t xml:space="preserve">Deve </w:t>
-      </w:r>
-      <w:r>
-        <w:rPr>
-          <w:i w:val="0"/>
-          <w:color w:val="000000"/>
-          <w:lang w:val="pt-PT"/>
-        </w:rPr>
-        <w:t>ser responsivo</w:t>
-      </w:r>
-      <w:r>
-        <w:rPr>
-          <w:i w:val="0"/>
-          <w:color w:val="000000"/>
-          <w:lang w:val="pt-PT"/>
-        </w:rPr>
-        <w:t>, permitindo o acesso a diferentes tamanhos de tela</w:t>
+        <w:t>Deve usar a linguagem de programação Java;</w:t>
       </w:r>
     </w:p>
     <w:p>
@@ -3085,8 +2979,72 @@
           <w:color w:val="000000"/>
           <w:lang w:val="pt-PT"/>
         </w:rPr>
-        <w:t>Deve usar a linguagem de programação Java;</w:t>
+        <w:t xml:space="preserve">Deve ser entregue até </w:t>
       </w:r>
+      <w:r>
+        <w:rPr>
+          <w:i w:val="0"/>
+          <w:color w:val="000000"/>
+          <w:lang w:val="pt-PT"/>
+        </w:rPr>
+        <w:t>junho</w:t>
+      </w:r>
+      <w:r>
+        <w:rPr>
+          <w:i w:val="0"/>
+          <w:color w:val="000000"/>
+          <w:lang w:val="pt-PT"/>
+        </w:rPr>
+        <w:t xml:space="preserve"> de 20</w:t>
+      </w:r>
+      <w:r>
+        <w:rPr>
+          <w:i w:val="0"/>
+          <w:color w:val="000000"/>
+          <w:lang w:val="pt-PT"/>
+        </w:rPr>
+        <w:t>2</w:t>
+      </w:r>
+      <w:r>
+        <w:rPr>
+          <w:i w:val="0"/>
+          <w:color w:val="000000"/>
+          <w:lang w:val="pt-PT"/>
+        </w:rPr>
+        <w:t>6</w:t>
+      </w:r>
+      <w:r>
+        <w:rPr>
+          <w:i w:val="0"/>
+          <w:color w:val="000000"/>
+          <w:lang w:val="pt-PT"/>
+        </w:rPr>
+        <w:t>;</w:t>
+      </w:r>
+    </w:p>
+    <w:p>
+      <w:pPr>
+        <w:pStyle w:val="PargrafodaLista"/>
+        <w:rPr>
+          <w:lang w:val="pt-PT"/>
+        </w:rPr>
+      </w:pPr>
+    </w:p>
+    <w:p>
+      <w:pPr>
+        <w:pStyle w:val="Ttulo1"/>
+        <w:rPr>
+          <w:lang w:val="pt-PT"/>
+        </w:rPr>
+      </w:pPr>
+      <w:bookmarkStart w:id="21" w:name="_Toc41559917"/>
+      <w:r>
+        <w:rPr>
+          <w:lang w:val="pt-PT"/>
+        </w:rPr>
+        <w:t>Riscos</w:t>
+      </w:r>
+      <w:bookmarkEnd w:id="21"/>
     </w:p>
     <w:p>
       <w:pPr>
@@ -3107,102 +3065,6 @@
           <w:color w:val="000000"/>
           <w:lang w:val="pt-PT"/>
         </w:rPr>
-        <w:t xml:space="preserve">Deve ser entregue até </w:t>
-      </w:r>
-      <w:r>
-        <w:rPr>
-          <w:i w:val="0"/>
-          <w:color w:val="000000"/>
-          <w:lang w:val="pt-PT"/>
-        </w:rPr>
-        <w:t>junho</w:t>
-      </w:r>
-      <w:r>
-        <w:rPr>
-          <w:i w:val="0"/>
-          <w:color w:val="000000"/>
-          <w:lang w:val="pt-PT"/>
-        </w:rPr>
-        <w:t xml:space="preserve"> de 20</w:t>
-      </w:r>
-      <w:r>
-        <w:rPr>
-          <w:i w:val="0"/>
-          <w:color w:val="000000"/>
-          <w:lang w:val="pt-PT"/>
-        </w:rPr>
-        <w:t>2</w:t>
-      </w:r>
-      <w:r>
-        <w:rPr>
-          <w:i w:val="0"/>
-          <w:color w:val="000000"/>
-          <w:lang w:val="pt-PT"/>
-        </w:rPr>
-        <w:t>6</w:t>
-      </w:r>
-      <w:r>
-        <w:rPr>
-          <w:i w:val="0"/>
-          <w:color w:val="000000"/>
-          <w:lang w:val="pt-PT"/>
-        </w:rPr>
-        <w:t>;</w:t>
-      </w:r>
-    </w:p>
-    <w:p>
-      <w:pPr>
-        <w:pStyle w:val="PargrafodaLista"/>
-        <w:numPr>
-          <w:ilvl w:val="0"/>
-          <w:numId w:val="7"/>
-        </w:numPr>
-        <w:rPr>
-          <w:lang w:val="pt-PT"/>
-        </w:rPr>
-      </w:pPr>
-      <w:r>
-        <w:rPr>
-          <w:lang w:val="pt-PT"/>
-        </w:rPr>
-        <w:t>Deve suportar múltiplas requisições simultâneas de usuários.</w:t>
-      </w:r>
-    </w:p>
-    <w:p>
-      <w:pPr>
-        <w:pStyle w:val="Ttulo1"/>
-        <w:rPr>
-          <w:lang w:val="pt-PT"/>
-        </w:rPr>
-      </w:pPr>
-      <w:bookmarkStart w:id="21" w:name="_Toc41559917"/>
-      <w:r>
-        <w:rPr>
-          <w:lang w:val="pt-PT"/>
-        </w:rPr>
-        <w:t>Riscos</w:t>
-      </w:r>
-      <w:bookmarkEnd w:id="21"/>
-    </w:p>
-    <w:p>
-      <w:pPr>
-        <w:pStyle w:val="Instruo"/>
-        <w:numPr>
-          <w:ilvl w:val="0"/>
-          <w:numId w:val="7"/>
-        </w:numPr>
-        <w:rPr>
-          <w:i w:val="0"/>
-          <w:color w:val="000000"/>
-          <w:lang w:val="pt-PT"/>
-        </w:rPr>
-      </w:pPr>
-      <w:r>
-        <w:rPr>
-          <w:i w:val="0"/>
-          <w:color w:val="000000"/>
-          <w:lang w:val="pt-PT"/>
-        </w:rPr>
         <w:t xml:space="preserve">Cumprimento de prazo dada a </w:t>
       </w:r>
       <w:r>
@@ -3260,8 +3122,8 @@
       </w:r>
     </w:p>
     <w:sectPr>
-      <w:headerReference w:type="default" r:id="rId15"/>
-      <w:footerReference w:type="default" r:id="rId16"/>
+      <w:headerReference w:type="default" r:id="rId16"/>
+      <w:footerReference w:type="default" r:id="rId17"/>
       <w:pgSz w:w="11907" w:h="16840" w:code="9"/>
       <w:pgMar w:top="851" w:right="851" w:bottom="851" w:left="1418" w:header="851" w:footer="851" w:gutter="0"/>
       <w:cols w:space="708"/>
@@ -4051,10 +3913,10 @@
                 <v:path o:extrusionok="f" gradientshapeok="t" o:connecttype="rect"/>
                 <o:lock v:ext="edit" aspectratio="t"/>
               </v:shapetype>
-              <v:shape id="_x0000_i1025" type="#_x0000_t75" style="width:64.5pt;height:36pt">
+              <v:shape id="_x0000_i1025" type="#_x0000_t75" style="width:64.8pt;height:36pt">
                 <v:imagedata r:id="rId1" o:title=""/>
               </v:shape>
-              <o:OLEObject Type="Embed" ProgID="Word.Picture.8" ShapeID="_x0000_i1025" DrawAspect="Content" ObjectID="_1835638600" r:id="rId2"/>
+              <o:OLEObject Type="Embed" ProgID="Word.Picture.8" ShapeID="_x0000_i1025" DrawAspect="Content" ObjectID="_1837104892" r:id="rId2"/>
             </w:object>
           </w:r>
         </w:p>
@@ -4188,10 +4050,10 @@
                 <v:path o:extrusionok="f" gradientshapeok="t" o:connecttype="rect"/>
                 <o:lock v:ext="edit" aspectratio="t"/>
               </v:shapetype>
-              <v:shape id="_x0000_i1026" type="#_x0000_t75" style="width:64.5pt;height:36pt">
+              <v:shape id="_x0000_i1026" type="#_x0000_t75" style="width:64.8pt;height:36pt">
                 <v:imagedata r:id="rId1" o:title=""/>
               </v:shape>
-              <o:OLEObject Type="Embed" ProgID="Word.Picture.8" ShapeID="_x0000_i1026" DrawAspect="Content" ObjectID="_1835638601" r:id="rId2"/>
+              <o:OLEObject Type="Embed" ProgID="Word.Picture.8" ShapeID="_x0000_i1026" DrawAspect="Content" ObjectID="_1837104893" r:id="rId2"/>
             </w:object>
           </w:r>
         </w:p>
@@ -4325,10 +4187,10 @@
                 <v:path o:extrusionok="f" gradientshapeok="t" o:connecttype="rect"/>
                 <o:lock v:ext="edit" aspectratio="t"/>
               </v:shapetype>
-              <v:shape id="_x0000_i1027" type="#_x0000_t75" style="width:64.5pt;height:36pt">
+              <v:shape id="_x0000_i1027" type="#_x0000_t75" style="width:64.8pt;height:36pt">
                 <v:imagedata r:id="rId1" o:title=""/>
               </v:shape>
-              <o:OLEObject Type="Embed" ProgID="Word.Picture.8" ShapeID="_x0000_i1027" DrawAspect="Content" ObjectID="_1835638602" r:id="rId2"/>
+              <o:OLEObject Type="Embed" ProgID="Word.Picture.8" ShapeID="_x0000_i1027" DrawAspect="Content" ObjectID="_1837104894" r:id="rId2"/>
             </w:object>
           </w:r>
         </w:p>
@@ -6340,6 +6202,7 @@
   <w:style w:type="character" w:default="1" w:styleId="Fontepargpadro">
     <w:name w:val="Default Paragraph Font"/>
     <w:uiPriority w:val="1"/>
+    <w:semiHidden/>
     <w:unhideWhenUsed/>
   </w:style>
   <w:style w:type="table" w:default="1" w:styleId="Tabelanormal">
@@ -6809,7 +6672,6 @@
     <w:sig w:usb0="E0002EFF" w:usb1="C000785B" w:usb2="00000009" w:usb3="00000000" w:csb0="000001FF" w:csb1="00000000"/>
   </w:font>
   <w:font w:name="MS Mincho">
-    <w:altName w:val="ＭＳ 明朝"/>
     <w:panose1 w:val="02020609040205080304"/>
     <w:charset w:val="80"/>
     <w:family w:val="modern"/>
@@ -6886,11 +6748,17 @@
     <w:rsidRoot w:val="005E19B7"/>
     <w:rsid w:val="00003032"/>
     <w:rsid w:val="00122E3C"/>
+    <w:rsid w:val="004303C8"/>
     <w:rsid w:val="005E19B7"/>
     <w:rsid w:val="00791E71"/>
     <w:rsid w:val="007A5A0B"/>
+    <w:rsid w:val="007E72CF"/>
     <w:rsid w:val="008007B0"/>
     <w:rsid w:val="0086231B"/>
+    <w:rsid w:val="008F330D"/>
+    <w:rsid w:val="00A03820"/>
+    <w:rsid w:val="00B55C48"/>
+    <w:rsid w:val="00D53007"/>
     <w:rsid w:val="00F07686"/>
   </w:rsids>
   <m:mathPr>

</xml_diff>

<commit_message>
Alteração - documento de visão
</commit_message>
<xml_diff>
--- a/gq-spinoff/1.Requisitos/gq-spinoff - Visão.docx
+++ b/gq-spinoff/1.Requisitos/gq-spinoff - Visão.docx
@@ -1865,28 +1865,23 @@
           <w:sz w:val="20"/>
           <w:szCs w:val="20"/>
         </w:rPr>
-        <w:t>O professor da disciplina de Engenharia de Software do curso de Análise e Desenvolvimento de Sistemas (ADS) disponibiliza aos alunos uma planilha em Excel denominada “Checklist de Verificação”. Essa ferramenta tem como objetivo acompanhar as etapas do processo de desenvolvimento de sistemas simplificados, permitindo avaliar a qualidade dos produtos gerados.</w:t>
+        <w:t xml:space="preserve">É feito a garantia da qualidade por meio de checklist manual, com o </w:t>
       </w:r>
-    </w:p>
-    <w:p>
-      <w:pPr>
-        <w:pStyle w:val="NormalWeb"/>
-        <w:ind w:firstLine="708"/>
-        <w:contextualSpacing/>
-        <w:jc w:val="both"/>
+      <w:r>
         <w:rPr>
           <w:rFonts w:ascii="Arial" w:hAnsi="Arial" w:cs="Arial"/>
           <w:sz w:val="20"/>
           <w:szCs w:val="20"/>
         </w:rPr>
-      </w:pPr>
+        <w:t>objetivo</w:t>
+      </w:r>
       <w:r>
         <w:rPr>
           <w:rFonts w:ascii="Arial" w:hAnsi="Arial" w:cs="Arial"/>
           <w:sz w:val="20"/>
           <w:szCs w:val="20"/>
         </w:rPr>
-        <w:t xml:space="preserve">A planilha é composta por abas que apresentam indicadores de aderência em porcentagem e gráficos que possibilitam a visualização do progresso dos artefatos em cada fase do processo. Além disso, há abas específicas para cada </w:t>
+        <w:t xml:space="preserve"> de</w:t>
       </w:r>
       <w:r>
         <w:rPr>
@@ -1894,7 +1889,7 @@
           <w:sz w:val="20"/>
           <w:szCs w:val="20"/>
         </w:rPr>
-        <w:t>fase (Iniciação, Elaboração, Construção, Transição)</w:t>
+        <w:t xml:space="preserve"> acompanhar as etapas do processo de desenvolvimento de sistemas simplificados</w:t>
       </w:r>
       <w:r>
         <w:rPr>
@@ -1902,39 +1897,7 @@
           <w:sz w:val="20"/>
           <w:szCs w:val="20"/>
         </w:rPr>
-        <w:t xml:space="preserve">, contendo perguntas de verificação relacionadas às respectivas </w:t>
-      </w:r>
-      <w:r>
-        <w:rPr>
-          <w:rFonts w:ascii="Arial" w:hAnsi="Arial" w:cs="Arial"/>
-          <w:sz w:val="20"/>
-          <w:szCs w:val="20"/>
-        </w:rPr>
-        <w:t>disciplinas</w:t>
-      </w:r>
-      <w:r>
-        <w:rPr>
-          <w:rFonts w:ascii="Arial" w:hAnsi="Arial" w:cs="Arial"/>
-          <w:sz w:val="20"/>
-          <w:szCs w:val="20"/>
-        </w:rPr>
-        <w:t xml:space="preserve">. Com base no preenchimento realizado pelo </w:t>
-      </w:r>
-      <w:r>
-        <w:rPr>
-          <w:rFonts w:ascii="Arial" w:hAnsi="Arial" w:cs="Arial"/>
-          <w:sz w:val="20"/>
-          <w:szCs w:val="20"/>
-        </w:rPr>
-        <w:t>aluno verificador</w:t>
-      </w:r>
-      <w:r>
-        <w:rPr>
-          <w:rFonts w:ascii="Arial" w:hAnsi="Arial" w:cs="Arial"/>
-          <w:sz w:val="20"/>
-          <w:szCs w:val="20"/>
-        </w:rPr>
-        <w:t>, os resultados são automaticamente refletidos nos indicadores e gráficos, facilitando o acompanhamento do desempenho ao longo do desenvolvimento.</w:t>
+        <w:t>.</w:t>
       </w:r>
     </w:p>
     <w:p>
@@ -1963,37 +1926,43 @@
         <w:rPr>
           <w:lang w:val="pt-PT" w:eastAsia="en-US"/>
         </w:rPr>
-        <w:t xml:space="preserve">O objetivo é automatizar o </w:t>
+        <w:t xml:space="preserve">O objetivo é </w:t>
       </w:r>
       <w:r>
         <w:rPr>
           <w:lang w:val="pt-PT" w:eastAsia="en-US"/>
         </w:rPr>
-        <w:t>acompanhamento</w:t>
+        <w:t>desenvolver um sistema para</w:t>
       </w:r>
       <w:r>
         <w:rPr>
           <w:lang w:val="pt-PT" w:eastAsia="en-US"/>
         </w:rPr>
-        <w:t xml:space="preserve"> da planilha </w:t>
+        <w:t xml:space="preserve"> </w:t>
       </w:r>
       <w:r>
         <w:rPr>
           <w:lang w:val="pt-PT" w:eastAsia="en-US"/>
         </w:rPr>
-        <w:t>“Checklist de Verificação”, utilizada para monitorar a</w:t>
+        <w:t>acompanhar o checklist de verificação</w:t>
       </w:r>
       <w:r>
         <w:rPr>
           <w:lang w:val="pt-PT" w:eastAsia="en-US"/>
         </w:rPr>
-        <w:t xml:space="preserve"> qualidade dos produtos </w:t>
+        <w:t xml:space="preserve">, de acordo com o </w:t>
       </w:r>
       <w:r>
         <w:rPr>
           <w:lang w:val="pt-PT" w:eastAsia="en-US"/>
         </w:rPr>
-        <w:t>gerados em cada fase do processo de desenvolvimento de sistemas simplificados, de acordo com o modelo Spinoff.</w:t>
+        <w:t>as tarefas do</w:t>
+      </w:r>
+      <w:r>
+        <w:rPr>
+          <w:lang w:val="pt-PT" w:eastAsia="en-US"/>
+        </w:rPr>
+        <w:t xml:space="preserve"> Spinoff.</w:t>
       </w:r>
     </w:p>
     <w:p>
@@ -2044,6 +2013,44 @@
           <w:lang w:val="pt-PT" w:eastAsia="en-US"/>
         </w:rPr>
         <w:t xml:space="preserve"> um processo de desenvolvimento de sistemas simplificado que utiliza práticas do Processo Unificado e Método Scrum,  destinado principalmente a micro e pequenas empresas ou profissionais autônomos que não possuem um processo de engenharia de software definido.</w:t>
+      </w:r>
+    </w:p>
+    <w:p>
+      <w:pPr>
+        <w:rPr>
+          <w:lang w:val="pt-PT" w:eastAsia="en-US"/>
+        </w:rPr>
+      </w:pPr>
+    </w:p>
+    <w:p>
+      <w:pPr>
+        <w:rPr>
+          <w:lang w:val="pt-PT" w:eastAsia="en-US"/>
+        </w:rPr>
+      </w:pPr>
+      <w:r>
+        <w:rPr>
+          <w:lang w:val="pt-PT" w:eastAsia="en-US"/>
+        </w:rPr>
+        <w:t xml:space="preserve">Verificação – </w:t>
+      </w:r>
+      <w:r>
+        <w:rPr>
+          <w:lang w:val="pt-PT" w:eastAsia="en-US"/>
+        </w:rPr>
+        <w:t>É uma d</w:t>
+      </w:r>
+      <w:r>
+        <w:rPr>
+          <w:lang w:val="pt-PT" w:eastAsia="en-US"/>
+        </w:rPr>
+        <w:t>isciplina de Engenharia de Software</w:t>
+      </w:r>
+      <w:r>
+        <w:rPr>
+          <w:lang w:val="pt-PT" w:eastAsia="en-US"/>
+        </w:rPr>
+        <w:t>, que analise se o software está de acordo com a especificação.</w:t>
       </w:r>
     </w:p>
     <w:p>
@@ -2130,15 +2137,15 @@
         <w:tblLook w:val="04A0" w:firstRow="1" w:lastRow="0" w:firstColumn="1" w:lastColumn="0" w:noHBand="0" w:noVBand="1"/>
       </w:tblPr>
       <w:tblGrid>
-        <w:gridCol w:w="3594"/>
+        <w:gridCol w:w="3591"/>
         <w:gridCol w:w="2114"/>
-        <w:gridCol w:w="3843"/>
-        <w:gridCol w:w="5577"/>
+        <w:gridCol w:w="3840"/>
+        <w:gridCol w:w="5583"/>
       </w:tblGrid>
       <w:tr>
         <w:tc>
           <w:tcPr>
-            <w:tcW w:w="3652" w:type="dxa"/>
+            <w:tcW w:w="3591" w:type="dxa"/>
             <w:shd w:val="pct5" w:color="auto" w:fill="auto"/>
           </w:tcPr>
           <w:p>
@@ -2161,7 +2168,7 @@
         </w:tc>
         <w:tc>
           <w:tcPr>
-            <w:tcW w:w="2123" w:type="dxa"/>
+            <w:tcW w:w="2114" w:type="dxa"/>
             <w:shd w:val="pct5" w:color="auto" w:fill="auto"/>
           </w:tcPr>
           <w:p>
@@ -2184,7 +2191,7 @@
         </w:tc>
         <w:tc>
           <w:tcPr>
-            <w:tcW w:w="3896" w:type="dxa"/>
+            <w:tcW w:w="3840" w:type="dxa"/>
             <w:shd w:val="pct5" w:color="auto" w:fill="auto"/>
           </w:tcPr>
           <w:p>
@@ -2207,7 +2214,7 @@
         </w:tc>
         <w:tc>
           <w:tcPr>
-            <w:tcW w:w="5683" w:type="dxa"/>
+            <w:tcW w:w="5583" w:type="dxa"/>
             <w:shd w:val="pct5" w:color="auto" w:fill="auto"/>
           </w:tcPr>
           <w:p>
@@ -2240,21 +2247,18 @@
       <w:tr>
         <w:tc>
           <w:tcPr>
-            <w:tcW w:w="3652" w:type="dxa"/>
+            <w:tcW w:w="3591" w:type="dxa"/>
           </w:tcPr>
           <w:p/>
           <w:p>
             <w:r>
-              <w:t>Controle centralizado do monitoramento da qualidade dos projetos</w:t>
-            </w:r>
-            <w:r>
-              <w:t>.</w:t>
+              <w:t>Verificação manual feita por meio de planilhas.</w:t>
             </w:r>
           </w:p>
         </w:tc>
         <w:tc>
           <w:tcPr>
-            <w:tcW w:w="2123" w:type="dxa"/>
+            <w:tcW w:w="2114" w:type="dxa"/>
           </w:tcPr>
           <w:p>
             <w:pPr>
@@ -2278,10 +2282,22 @@
               <w:t>Aluno</w:t>
             </w:r>
           </w:p>
+          <w:p>
+            <w:pPr>
+              <w:pStyle w:val="PargrafodaLista"/>
+              <w:numPr>
+                <w:ilvl w:val="0"/>
+                <w:numId w:val="12"/>
+              </w:numPr>
+            </w:pPr>
+            <w:r>
+              <w:t>Professor</w:t>
+            </w:r>
+          </w:p>
         </w:tc>
         <w:tc>
           <w:tcPr>
-            <w:tcW w:w="3896" w:type="dxa"/>
+            <w:tcW w:w="3840" w:type="dxa"/>
           </w:tcPr>
           <w:p>
             <w:pPr>
@@ -2300,6 +2316,7 @@
                 <w:ilvl w:val="0"/>
                 <w:numId w:val="10"/>
               </w:numPr>
+              <w:jc w:val="left"/>
             </w:pPr>
             <w:r>
               <w:t>Dependência de arquivos locais, aumentando o risco de perda de dados.</w:t>
@@ -2308,9 +2325,14 @@
         </w:tc>
         <w:tc>
           <w:tcPr>
-            <w:tcW w:w="5683" w:type="dxa"/>
+            <w:tcW w:w="5583" w:type="dxa"/>
           </w:tcPr>
           <w:p>
+            <w:pPr>
+              <w:rPr>
+                <w:lang w:val="pt-PT"/>
+              </w:rPr>
+            </w:pPr>
             <w:r>
               <w:rPr>
                 <w:lang w:val="pt-PT"/>
@@ -2364,6 +2386,12 @@
                 <w:lang w:val="pt-PT"/>
               </w:rPr>
               <w:t>permitindo acesso rápido a facilitado às informações.</w:t>
+            </w:r>
+          </w:p>
+          <w:p/>
+          <w:p>
+            <w:r>
+              <w:t>Como professor, gostaria centralizar todos os projetos de meus alunos, para que eu não acumule várias planilhas baixadas no computador.</w:t>
             </w:r>
           </w:p>
           <w:p/>
@@ -2372,7 +2400,7 @@
       <w:tr>
         <w:tc>
           <w:tcPr>
-            <w:tcW w:w="3652" w:type="dxa"/>
+            <w:tcW w:w="3591" w:type="dxa"/>
           </w:tcPr>
           <w:p>
             <w:pPr>
@@ -2396,14 +2424,7 @@
                 <w:i w:val="0"/>
                 <w:color w:val="000000"/>
               </w:rPr>
-              <w:t>Ausência de c</w:t>
-            </w:r>
-            <w:r>
-              <w:rPr>
-                <w:i w:val="0"/>
-                <w:color w:val="000000"/>
-              </w:rPr>
-              <w:t>ontrole das versões utilizadas em cada projeto desenvolvido.</w:t>
+              <w:t>Dificuldade em fazer análise estatística das verificações</w:t>
             </w:r>
           </w:p>
           <w:p/>
@@ -2411,7 +2432,7 @@
         </w:tc>
         <w:tc>
           <w:tcPr>
-            <w:tcW w:w="2123" w:type="dxa"/>
+            <w:tcW w:w="2114" w:type="dxa"/>
           </w:tcPr>
           <w:p>
             <w:pPr>
@@ -2434,7 +2455,7 @@
         </w:tc>
         <w:tc>
           <w:tcPr>
-            <w:tcW w:w="3896" w:type="dxa"/>
+            <w:tcW w:w="3840" w:type="dxa"/>
           </w:tcPr>
           <w:p>
             <w:pPr>
@@ -2462,15 +2483,139 @@
                 <w:i w:val="0"/>
                 <w:color w:val="000000"/>
               </w:rPr>
-              <w:t>Ausência de controle de versões nas verificações realizadas</w:t>
+              <w:t xml:space="preserve">Ausência de controle </w:t>
+            </w:r>
+            <w:r>
+              <w:rPr>
+                <w:i w:val="0"/>
+                <w:color w:val="000000"/>
+              </w:rPr>
+              <w:t>de quais as tarefas e disciplinas que os alunos estão tendo mais dificuldades.</w:t>
             </w:r>
           </w:p>
+        </w:tc>
+        <w:tc>
+          <w:tcPr>
+            <w:tcW w:w="5583" w:type="dxa"/>
+          </w:tcPr>
+          <w:p>
+            <w:pPr>
+              <w:pStyle w:val="Instruo"/>
+              <w:rPr>
+                <w:lang w:val="pt-PT"/>
+              </w:rPr>
+            </w:pPr>
+          </w:p>
+          <w:p>
+            <w:pPr>
+              <w:rPr>
+                <w:lang w:val="pt-PT"/>
+              </w:rPr>
+            </w:pPr>
+            <w:r>
+              <w:rPr>
+                <w:lang w:val="pt-PT"/>
+              </w:rPr>
+              <w:t>Como professor, gostaria de</w:t>
+            </w:r>
+            <w:r>
+              <w:rPr>
+                <w:lang w:val="pt-PT"/>
+              </w:rPr>
+              <w:t xml:space="preserve"> </w:t>
+            </w:r>
+            <w:r>
+              <w:rPr>
+                <w:lang w:val="pt-PT"/>
+              </w:rPr>
+              <w:t>consultar</w:t>
+            </w:r>
+            <w:r>
+              <w:rPr>
+                <w:lang w:val="pt-PT"/>
+              </w:rPr>
+              <w:t xml:space="preserve"> as estatísitcas de</w:t>
+            </w:r>
+            <w:r>
+              <w:rPr>
+                <w:lang w:val="pt-PT"/>
+              </w:rPr>
+              <w:t xml:space="preserve"> quais as tarefas e disciplinas que possuem menos aderência</w:t>
+            </w:r>
+            <w:r>
+              <w:rPr>
+                <w:lang w:val="pt-PT"/>
+              </w:rPr>
+              <w:t xml:space="preserve"> nos projetos</w:t>
+            </w:r>
+            <w:r>
+              <w:rPr>
+                <w:lang w:val="pt-PT"/>
+              </w:rPr>
+              <w:t>, para que eu possa identificar pontos de melhoria.</w:t>
+            </w:r>
+          </w:p>
+          <w:p>
+            <w:pPr>
+              <w:rPr>
+                <w:lang w:val="pt-PT"/>
+              </w:rPr>
+            </w:pPr>
+          </w:p>
+        </w:tc>
+      </w:tr>
+      <w:tr>
+        <w:trPr>
+          <w:trHeight w:val="1265"/>
+        </w:trPr>
+        <w:tc>
+          <w:tcPr>
+            <w:tcW w:w="3591" w:type="dxa"/>
+          </w:tcPr>
+          <w:p>
+            <w:pPr>
+              <w:pStyle w:val="Instruo"/>
+              <w:rPr>
+                <w:i w:val="0"/>
+                <w:color w:val="000000"/>
+              </w:rPr>
+            </w:pPr>
+            <w:r>
+              <w:rPr>
+                <w:i w:val="0"/>
+                <w:color w:val="000000"/>
+              </w:rPr>
+              <w:t>Dificuldade em realizar a verificação por planilhas</w:t>
+            </w:r>
+          </w:p>
+        </w:tc>
+        <w:tc>
+          <w:tcPr>
+            <w:tcW w:w="2114" w:type="dxa"/>
+          </w:tcPr>
+          <w:p>
+            <w:pPr>
+              <w:pStyle w:val="PargrafodaLista"/>
+              <w:numPr>
+                <w:ilvl w:val="0"/>
+                <w:numId w:val="17"/>
+              </w:numPr>
+            </w:pPr>
+            <w:r>
+              <w:t>Professor</w:t>
+            </w:r>
+          </w:p>
+        </w:tc>
+        <w:tc>
+          <w:tcPr>
+            <w:tcW w:w="3840" w:type="dxa"/>
+          </w:tcPr>
           <w:p>
             <w:pPr>
               <w:pStyle w:val="Instruo"/>
               <w:numPr>
                 <w:ilvl w:val="0"/>
-                <w:numId w:val="15"/>
+                <w:numId w:val="17"/>
               </w:numPr>
               <w:rPr>
                 <w:i w:val="0"/>
@@ -2482,67 +2627,30 @@
                 <w:i w:val="0"/>
                 <w:color w:val="000000"/>
               </w:rPr>
-              <w:t>Perda de rastreabilidade, tornando difícil identificar qual versão foi utilizada em determinado resultado</w:t>
+              <w:t>Controle de muitas planilhas</w:t>
+            </w:r>
+          </w:p>
+          <w:p>
+            <w:pPr>
+              <w:pStyle w:val="PargrafodaLista"/>
+              <w:numPr>
+                <w:ilvl w:val="0"/>
+                <w:numId w:val="17"/>
+              </w:numPr>
+              <w:jc w:val="left"/>
+            </w:pPr>
+            <w:r>
+              <w:t>Criação de vários arquivos de planilhas.</w:t>
             </w:r>
           </w:p>
         </w:tc>
         <w:tc>
           <w:tcPr>
-            <w:tcW w:w="5683" w:type="dxa"/>
+            <w:tcW w:w="5583" w:type="dxa"/>
           </w:tcPr>
           <w:p>
             <w:pPr>
               <w:pStyle w:val="Instruo"/>
-              <w:rPr>
-                <w:lang w:val="pt-PT"/>
-              </w:rPr>
-            </w:pPr>
-          </w:p>
-          <w:p>
-            <w:pPr>
-              <w:rPr>
-                <w:lang w:val="pt-PT"/>
-              </w:rPr>
-            </w:pPr>
-            <w:r>
-              <w:rPr>
-                <w:lang w:val="pt-PT"/>
-              </w:rPr>
-              <w:t>Como professor, gostaria de</w:t>
-            </w:r>
-            <w:r>
-              <w:rPr>
-                <w:lang w:val="pt-PT"/>
-              </w:rPr>
-              <w:t xml:space="preserve"> </w:t>
-            </w:r>
-            <w:r>
-              <w:rPr>
-                <w:lang w:val="pt-PT"/>
-              </w:rPr>
-              <w:t>atualizar</w:t>
-            </w:r>
-            <w:r>
-              <w:rPr>
-                <w:lang w:val="pt-PT"/>
-              </w:rPr>
-              <w:t xml:space="preserve"> as perguntas de verificaçã</w:t>
-            </w:r>
-            <w:r>
-              <w:rPr>
-                <w:lang w:val="pt-PT"/>
-              </w:rPr>
-              <w:t>o</w:t>
-            </w:r>
-            <w:r>
-              <w:rPr>
-                <w:lang w:val="pt-PT"/>
-              </w:rPr>
-              <w:t xml:space="preserve"> visando a melhoria contínua do processo, sem impactar os projetos em andamento ou finalizados.</w:t>
-            </w:r>
-          </w:p>
-          <w:p>
-            <w:pPr>
               <w:rPr>
                 <w:lang w:val="pt-PT"/>
               </w:rPr>
@@ -3893,7 +4001,7 @@
             <w:rPr>
               <w:b/>
             </w:rPr>
-            <w:object w:dxaOrig="1290" w:dyaOrig="720" w14:anchorId="279A4487">
+            <w:object w:dxaOrig="1296" w:dyaOrig="720" w14:anchorId="279A4487">
               <v:shapetype id="_x0000_t75" coordsize="21600,21600" o:spt="75" o:preferrelative="t" path="m@4@5l@4@11@9@11@9@5xe" filled="f" stroked="f">
                 <v:stroke joinstyle="miter"/>
                 <v:formulas>
@@ -3913,10 +4021,10 @@
                 <v:path o:extrusionok="f" gradientshapeok="t" o:connecttype="rect"/>
                 <o:lock v:ext="edit" aspectratio="t"/>
               </v:shapetype>
-              <v:shape id="_x0000_i1025" type="#_x0000_t75" style="width:64.8pt;height:36pt">
+              <v:shape id="_x0000_i1025" type="#_x0000_t75" style="width:64.5pt;height:36pt">
                 <v:imagedata r:id="rId1" o:title=""/>
               </v:shape>
-              <o:OLEObject Type="Embed" ProgID="Word.Picture.8" ShapeID="_x0000_i1025" DrawAspect="Content" ObjectID="_1837104892" r:id="rId2"/>
+              <o:OLEObject Type="Embed" ProgID="Word.Picture.8" ShapeID="_x0000_i1025" DrawAspect="Content" ObjectID="_1837669133" r:id="rId2"/>
             </w:object>
           </w:r>
         </w:p>
@@ -4030,7 +4138,7 @@
             <w:rPr>
               <w:b/>
             </w:rPr>
-            <w:object w:dxaOrig="1290" w:dyaOrig="720" w14:anchorId="6443A6A3">
+            <w:object w:dxaOrig="1296" w:dyaOrig="720" w14:anchorId="6443A6A3">
               <v:shapetype id="_x0000_t75" coordsize="21600,21600" o:spt="75" o:preferrelative="t" path="m@4@5l@4@11@9@11@9@5xe" filled="f" stroked="f">
                 <v:stroke joinstyle="miter"/>
                 <v:formulas>
@@ -4050,10 +4158,10 @@
                 <v:path o:extrusionok="f" gradientshapeok="t" o:connecttype="rect"/>
                 <o:lock v:ext="edit" aspectratio="t"/>
               </v:shapetype>
-              <v:shape id="_x0000_i1026" type="#_x0000_t75" style="width:64.8pt;height:36pt">
+              <v:shape id="_x0000_i1026" type="#_x0000_t75" style="width:64.5pt;height:36pt">
                 <v:imagedata r:id="rId1" o:title=""/>
               </v:shape>
-              <o:OLEObject Type="Embed" ProgID="Word.Picture.8" ShapeID="_x0000_i1026" DrawAspect="Content" ObjectID="_1837104893" r:id="rId2"/>
+              <o:OLEObject Type="Embed" ProgID="Word.Picture.8" ShapeID="_x0000_i1026" DrawAspect="Content" ObjectID="_1837669134" r:id="rId2"/>
             </w:object>
           </w:r>
         </w:p>
@@ -4167,7 +4275,7 @@
             <w:rPr>
               <w:b/>
             </w:rPr>
-            <w:object w:dxaOrig="1290" w:dyaOrig="720" w14:anchorId="125CB2E1">
+            <w:object w:dxaOrig="1296" w:dyaOrig="720" w14:anchorId="125CB2E1">
               <v:shapetype id="_x0000_t75" coordsize="21600,21600" o:spt="75" o:preferrelative="t" path="m@4@5l@4@11@9@11@9@5xe" filled="f" stroked="f">
                 <v:stroke joinstyle="miter"/>
                 <v:formulas>
@@ -4187,10 +4295,10 @@
                 <v:path o:extrusionok="f" gradientshapeok="t" o:connecttype="rect"/>
                 <o:lock v:ext="edit" aspectratio="t"/>
               </v:shapetype>
-              <v:shape id="_x0000_i1027" type="#_x0000_t75" style="width:64.8pt;height:36pt">
+              <v:shape id="_x0000_i1027" type="#_x0000_t75" style="width:64.5pt;height:36pt">
                 <v:imagedata r:id="rId1" o:title=""/>
               </v:shape>
-              <o:OLEObject Type="Embed" ProgID="Word.Picture.8" ShapeID="_x0000_i1027" DrawAspect="Content" ObjectID="_1837104894" r:id="rId2"/>
+              <o:OLEObject Type="Embed" ProgID="Word.Picture.8" ShapeID="_x0000_i1027" DrawAspect="Content" ObjectID="_1837669135" r:id="rId2"/>
             </w:object>
           </w:r>
         </w:p>
@@ -4866,6 +4974,95 @@
     </w:lvl>
   </w:abstractNum>
   <w:abstractNum w:abstractNumId="5" w15:restartNumberingAfterBreak="0">
+    <w:nsid w:val="47166C90"/>
+    <w:multiLevelType w:val="hybridMultilevel"/>
+    <w:tmpl w:val="67CC7880"/>
+    <w:lvl w:ilvl="0" w:tplc="3098AEDA">
+      <w:start w:val="1"/>
+      <w:numFmt w:val="decimal"/>
+      <w:lvlText w:val="%1."/>
+      <w:lvlJc w:val="left"/>
+      <w:pPr>
+        <w:ind w:left="360" w:hanging="360"/>
+      </w:pPr>
+      <w:rPr>
+        <w:rFonts w:hint="default"/>
+      </w:rPr>
+    </w:lvl>
+    <w:lvl w:ilvl="1" w:tplc="04160019" w:tentative="1">
+      <w:start w:val="1"/>
+      <w:numFmt w:val="lowerLetter"/>
+      <w:lvlText w:val="%2."/>
+      <w:lvlJc w:val="left"/>
+      <w:pPr>
+        <w:ind w:left="1080" w:hanging="360"/>
+      </w:pPr>
+    </w:lvl>
+    <w:lvl w:ilvl="2" w:tplc="0416001B" w:tentative="1">
+      <w:start w:val="1"/>
+      <w:numFmt w:val="lowerRoman"/>
+      <w:lvlText w:val="%3."/>
+      <w:lvlJc w:val="right"/>
+      <w:pPr>
+        <w:ind w:left="1800" w:hanging="180"/>
+      </w:pPr>
+    </w:lvl>
+    <w:lvl w:ilvl="3" w:tplc="0416000F" w:tentative="1">
+      <w:start w:val="1"/>
+      <w:numFmt w:val="decimal"/>
+      <w:lvlText w:val="%4."/>
+      <w:lvlJc w:val="left"/>
+      <w:pPr>
+        <w:ind w:left="2520" w:hanging="360"/>
+      </w:pPr>
+    </w:lvl>
+    <w:lvl w:ilvl="4" w:tplc="04160019" w:tentative="1">
+      <w:start w:val="1"/>
+      <w:numFmt w:val="lowerLetter"/>
+      <w:lvlText w:val="%5."/>
+      <w:lvlJc w:val="left"/>
+      <w:pPr>
+        <w:ind w:left="3240" w:hanging="360"/>
+      </w:pPr>
+    </w:lvl>
+    <w:lvl w:ilvl="5" w:tplc="0416001B" w:tentative="1">
+      <w:start w:val="1"/>
+      <w:numFmt w:val="lowerRoman"/>
+      <w:lvlText w:val="%6."/>
+      <w:lvlJc w:val="right"/>
+      <w:pPr>
+        <w:ind w:left="3960" w:hanging="180"/>
+      </w:pPr>
+    </w:lvl>
+    <w:lvl w:ilvl="6" w:tplc="0416000F" w:tentative="1">
+      <w:start w:val="1"/>
+      <w:numFmt w:val="decimal"/>
+      <w:lvlText w:val="%7."/>
+      <w:lvlJc w:val="left"/>
+      <w:pPr>
+        <w:ind w:left="4680" w:hanging="360"/>
+      </w:pPr>
+    </w:lvl>
+    <w:lvl w:ilvl="7" w:tplc="04160019" w:tentative="1">
+      <w:start w:val="1"/>
+      <w:numFmt w:val="lowerLetter"/>
+      <w:lvlText w:val="%8."/>
+      <w:lvlJc w:val="left"/>
+      <w:pPr>
+        <w:ind w:left="5400" w:hanging="360"/>
+      </w:pPr>
+    </w:lvl>
+    <w:lvl w:ilvl="8" w:tplc="0416001B" w:tentative="1">
+      <w:start w:val="1"/>
+      <w:numFmt w:val="lowerRoman"/>
+      <w:lvlText w:val="%9."/>
+      <w:lvlJc w:val="right"/>
+      <w:pPr>
+        <w:ind w:left="6120" w:hanging="180"/>
+      </w:pPr>
+    </w:lvl>
+  </w:abstractNum>
+  <w:abstractNum w:abstractNumId="6" w15:restartNumberingAfterBreak="0">
     <w:nsid w:val="593E7391"/>
     <w:multiLevelType w:val="hybridMultilevel"/>
     <w:tmpl w:val="59685156"/>
@@ -4954,7 +5151,7 @@
       </w:pPr>
     </w:lvl>
   </w:abstractNum>
-  <w:abstractNum w:abstractNumId="6" w15:restartNumberingAfterBreak="0">
+  <w:abstractNum w:abstractNumId="7" w15:restartNumberingAfterBreak="0">
     <w:nsid w:val="5E4D7051"/>
     <w:multiLevelType w:val="hybridMultilevel"/>
     <w:tmpl w:val="5E8CACE6"/>
@@ -5040,7 +5237,96 @@
       </w:pPr>
     </w:lvl>
   </w:abstractNum>
-  <w:abstractNum w:abstractNumId="7" w15:restartNumberingAfterBreak="0">
+  <w:abstractNum w:abstractNumId="8" w15:restartNumberingAfterBreak="0">
+    <w:nsid w:val="6897291D"/>
+    <w:multiLevelType w:val="hybridMultilevel"/>
+    <w:tmpl w:val="CD12C6B4"/>
+    <w:lvl w:ilvl="0" w:tplc="0416000F">
+      <w:start w:val="1"/>
+      <w:numFmt w:val="decimal"/>
+      <w:lvlText w:val="%1."/>
+      <w:lvlJc w:val="left"/>
+      <w:pPr>
+        <w:ind w:left="720" w:hanging="360"/>
+      </w:pPr>
+      <w:rPr>
+        <w:rFonts w:hint="default"/>
+      </w:rPr>
+    </w:lvl>
+    <w:lvl w:ilvl="1" w:tplc="04160019" w:tentative="1">
+      <w:start w:val="1"/>
+      <w:numFmt w:val="lowerLetter"/>
+      <w:lvlText w:val="%2."/>
+      <w:lvlJc w:val="left"/>
+      <w:pPr>
+        <w:ind w:left="1440" w:hanging="360"/>
+      </w:pPr>
+    </w:lvl>
+    <w:lvl w:ilvl="2" w:tplc="0416001B" w:tentative="1">
+      <w:start w:val="1"/>
+      <w:numFmt w:val="lowerRoman"/>
+      <w:lvlText w:val="%3."/>
+      <w:lvlJc w:val="right"/>
+      <w:pPr>
+        <w:ind w:left="2160" w:hanging="180"/>
+      </w:pPr>
+    </w:lvl>
+    <w:lvl w:ilvl="3" w:tplc="0416000F" w:tentative="1">
+      <w:start w:val="1"/>
+      <w:numFmt w:val="decimal"/>
+      <w:lvlText w:val="%4."/>
+      <w:lvlJc w:val="left"/>
+      <w:pPr>
+        <w:ind w:left="2880" w:hanging="360"/>
+      </w:pPr>
+    </w:lvl>
+    <w:lvl w:ilvl="4" w:tplc="04160019" w:tentative="1">
+      <w:start w:val="1"/>
+      <w:numFmt w:val="lowerLetter"/>
+      <w:lvlText w:val="%5."/>
+      <w:lvlJc w:val="left"/>
+      <w:pPr>
+        <w:ind w:left="3600" w:hanging="360"/>
+      </w:pPr>
+    </w:lvl>
+    <w:lvl w:ilvl="5" w:tplc="0416001B" w:tentative="1">
+      <w:start w:val="1"/>
+      <w:numFmt w:val="lowerRoman"/>
+      <w:lvlText w:val="%6."/>
+      <w:lvlJc w:val="right"/>
+      <w:pPr>
+        <w:ind w:left="4320" w:hanging="180"/>
+      </w:pPr>
+    </w:lvl>
+    <w:lvl w:ilvl="6" w:tplc="0416000F" w:tentative="1">
+      <w:start w:val="1"/>
+      <w:numFmt w:val="decimal"/>
+      <w:lvlText w:val="%7."/>
+      <w:lvlJc w:val="left"/>
+      <w:pPr>
+        <w:ind w:left="5040" w:hanging="360"/>
+      </w:pPr>
+    </w:lvl>
+    <w:lvl w:ilvl="7" w:tplc="04160019" w:tentative="1">
+      <w:start w:val="1"/>
+      <w:numFmt w:val="lowerLetter"/>
+      <w:lvlText w:val="%8."/>
+      <w:lvlJc w:val="left"/>
+      <w:pPr>
+        <w:ind w:left="5760" w:hanging="360"/>
+      </w:pPr>
+    </w:lvl>
+    <w:lvl w:ilvl="8" w:tplc="0416001B" w:tentative="1">
+      <w:start w:val="1"/>
+      <w:numFmt w:val="lowerRoman"/>
+      <w:lvlText w:val="%9."/>
+      <w:lvlJc w:val="right"/>
+      <w:pPr>
+        <w:ind w:left="6480" w:hanging="180"/>
+      </w:pPr>
+    </w:lvl>
+  </w:abstractNum>
+  <w:abstractNum w:abstractNumId="9" w15:restartNumberingAfterBreak="0">
     <w:nsid w:val="70441FBA"/>
     <w:multiLevelType w:val="hybridMultilevel"/>
     <w:tmpl w:val="8B082AC4"/>
@@ -5129,7 +5415,7 @@
       </w:pPr>
     </w:lvl>
   </w:abstractNum>
-  <w:abstractNum w:abstractNumId="8" w15:restartNumberingAfterBreak="0">
+  <w:abstractNum w:abstractNumId="10" w15:restartNumberingAfterBreak="0">
     <w:nsid w:val="72D2393C"/>
     <w:multiLevelType w:val="hybridMultilevel"/>
     <w:tmpl w:val="F822FC72"/>
@@ -5215,7 +5501,7 @@
       </w:pPr>
     </w:lvl>
   </w:abstractNum>
-  <w:abstractNum w:abstractNumId="9" w15:restartNumberingAfterBreak="0">
+  <w:abstractNum w:abstractNumId="11" w15:restartNumberingAfterBreak="0">
     <w:nsid w:val="73F37BFE"/>
     <w:multiLevelType w:val="hybridMultilevel"/>
     <w:tmpl w:val="FA704D92"/>
@@ -5356,7 +5642,7 @@
       </w:rPr>
     </w:lvl>
   </w:abstractNum>
-  <w:abstractNum w:abstractNumId="10" w15:restartNumberingAfterBreak="0">
+  <w:abstractNum w:abstractNumId="12" w15:restartNumberingAfterBreak="0">
     <w:nsid w:val="75CD01DE"/>
     <w:multiLevelType w:val="hybridMultilevel"/>
     <w:tmpl w:val="9B5ECE46"/>
@@ -5442,7 +5728,7 @@
       </w:pPr>
     </w:lvl>
   </w:abstractNum>
-  <w:abstractNum w:abstractNumId="11" w15:restartNumberingAfterBreak="0">
+  <w:abstractNum w:abstractNumId="13" w15:restartNumberingAfterBreak="0">
     <w:nsid w:val="775133A1"/>
     <w:multiLevelType w:val="multilevel"/>
     <w:tmpl w:val="65BC53E8"/>
@@ -5579,19 +5865,19 @@
     </w:lvl>
   </w:abstractNum>
   <w:num w:numId="1" w16cid:durableId="1699694089">
-    <w:abstractNumId w:val="9"/>
+    <w:abstractNumId w:val="11"/>
   </w:num>
   <w:num w:numId="2" w16cid:durableId="1415325323">
-    <w:abstractNumId w:val="11"/>
+    <w:abstractNumId w:val="13"/>
   </w:num>
   <w:num w:numId="3" w16cid:durableId="1827240661">
-    <w:abstractNumId w:val="11"/>
+    <w:abstractNumId w:val="13"/>
   </w:num>
   <w:num w:numId="4" w16cid:durableId="2120904375">
-    <w:abstractNumId w:val="11"/>
+    <w:abstractNumId w:val="13"/>
   </w:num>
   <w:num w:numId="5" w16cid:durableId="1977104100">
-    <w:abstractNumId w:val="11"/>
+    <w:abstractNumId w:val="13"/>
   </w:num>
   <w:num w:numId="6" w16cid:durableId="1106268166">
     <w:abstractNumId w:val="3"/>
@@ -5603,16 +5889,16 @@
     <w:abstractNumId w:val="4"/>
   </w:num>
   <w:num w:numId="9" w16cid:durableId="1777170949">
+    <w:abstractNumId w:val="12"/>
+  </w:num>
+  <w:num w:numId="10" w16cid:durableId="1056777426">
     <w:abstractNumId w:val="10"/>
   </w:num>
-  <w:num w:numId="10" w16cid:durableId="1056777426">
-    <w:abstractNumId w:val="8"/>
-  </w:num>
   <w:num w:numId="11" w16cid:durableId="1186210818">
-    <w:abstractNumId w:val="5"/>
+    <w:abstractNumId w:val="6"/>
   </w:num>
   <w:num w:numId="12" w16cid:durableId="679702140">
-    <w:abstractNumId w:val="6"/>
+    <w:abstractNumId w:val="7"/>
   </w:num>
   <w:num w:numId="13" w16cid:durableId="1208687484">
     <w:abstractNumId w:val="0"/>
@@ -5621,7 +5907,13 @@
     <w:abstractNumId w:val="1"/>
   </w:num>
   <w:num w:numId="15" w16cid:durableId="1888493417">
-    <w:abstractNumId w:val="7"/>
+    <w:abstractNumId w:val="9"/>
+  </w:num>
+  <w:num w:numId="16" w16cid:durableId="807354238">
+    <w:abstractNumId w:val="5"/>
+  </w:num>
+  <w:num w:numId="17" w16cid:durableId="944964818">
+    <w:abstractNumId w:val="8"/>
   </w:num>
   <w:numIdMacAtCleanup w:val="6"/>
 </w:numbering>
@@ -6500,7 +6792,6 @@
     <w:name w:val="Normal (Web)"/>
     <w:basedOn w:val="Normal"/>
     <w:uiPriority w:val="99"/>
-    <w:semiHidden/>
     <w:unhideWhenUsed/>
     <w:rsid w:val="00100CEB"/>
     <w:pPr>
@@ -6757,8 +7048,10 @@
     <w:rsid w:val="0086231B"/>
     <w:rsid w:val="008F330D"/>
     <w:rsid w:val="00A03820"/>
+    <w:rsid w:val="00B16B43"/>
     <w:rsid w:val="00B55C48"/>
     <w:rsid w:val="00D53007"/>
+    <w:rsid w:val="00EE321A"/>
     <w:rsid w:val="00F07686"/>
   </w:rsids>
   <m:mathPr>

</xml_diff>

<commit_message>
Exemplo - história de usuário
</commit_message>
<xml_diff>
--- a/gq-spinoff/1.Requisitos/gq-spinoff - Visão.docx
+++ b/gq-spinoff/1.Requisitos/gq-spinoff - Visão.docx
@@ -3921,7 +3921,7 @@
               <v:shape id="_x0000_i1025" type="#_x0000_t75" style="width:64.5pt;height:36pt">
                 <v:imagedata r:id="rId1" o:title=""/>
               </v:shape>
-              <o:OLEObject Type="Embed" ProgID="Word.Picture.8" ShapeID="_x0000_i1025" DrawAspect="Content" ObjectID="_1837712641" r:id="rId2"/>
+              <o:OLEObject Type="Embed" ProgID="Word.Picture.8" ShapeID="_x0000_i1025" DrawAspect="Content" ObjectID="_1837751092" r:id="rId2"/>
             </w:object>
           </w:r>
         </w:p>
@@ -4058,7 +4058,7 @@
               <v:shape id="_x0000_i1026" type="#_x0000_t75" style="width:64.5pt;height:36pt">
                 <v:imagedata r:id="rId1" o:title=""/>
               </v:shape>
-              <o:OLEObject Type="Embed" ProgID="Word.Picture.8" ShapeID="_x0000_i1026" DrawAspect="Content" ObjectID="_1837712642" r:id="rId2"/>
+              <o:OLEObject Type="Embed" ProgID="Word.Picture.8" ShapeID="_x0000_i1026" DrawAspect="Content" ObjectID="_1837751093" r:id="rId2"/>
             </w:object>
           </w:r>
         </w:p>
@@ -4195,7 +4195,7 @@
               <v:shape id="_x0000_i1027" type="#_x0000_t75" style="width:64.5pt;height:36pt">
                 <v:imagedata r:id="rId1" o:title=""/>
               </v:shape>
-              <o:OLEObject Type="Embed" ProgID="Word.Picture.8" ShapeID="_x0000_i1027" DrawAspect="Content" ObjectID="_1837712643" r:id="rId2"/>
+              <o:OLEObject Type="Embed" ProgID="Word.Picture.8" ShapeID="_x0000_i1027" DrawAspect="Content" ObjectID="_1837751094" r:id="rId2"/>
             </w:object>
           </w:r>
         </w:p>
@@ -6938,6 +6938,7 @@
     <w:rsid w:val="00003032"/>
     <w:rsid w:val="00122E3C"/>
     <w:rsid w:val="004303C8"/>
+    <w:rsid w:val="004A2A89"/>
     <w:rsid w:val="005E19B7"/>
     <w:rsid w:val="00791E71"/>
     <w:rsid w:val="007A5A0B"/>
@@ -6951,6 +6952,7 @@
     <w:rsid w:val="00B45BC2"/>
     <w:rsid w:val="00B55C48"/>
     <w:rsid w:val="00D53007"/>
+    <w:rsid w:val="00DC7A42"/>
     <w:rsid w:val="00EE321A"/>
     <w:rsid w:val="00F07686"/>
   </w:rsids>

</xml_diff>